<commit_message>
ajout bouscarat et telegraphe
</commit_message>
<xml_diff>
--- a/notice tertre.doc.docx
+++ b/notice tertre.doc.docx
@@ -34,91 +34,7 @@
         <w:rPr>
           <w:rFonts w:ascii="Garamond" w:hAnsi="Garamond"/>
         </w:rPr>
-        <w:t>Le Roux Malinsky et Nathan Temime</w:t>
-      </w:r>
-      <w:r>
-        <w:rPr>
-          <w:rFonts w:ascii="Garamond" w:hAnsi="Garamond"/>
-        </w:rPr>
-        <w:t>—</w:t>
-      </w:r>
-      <w:r>
-        <w:rPr>
-          <w:rFonts w:ascii="Garamond" w:hAnsi="Garamond"/>
-        </w:rPr>
-        <w:t>Voisin</w:t>
-      </w:r>
-      <w:r>
-        <w:rPr>
-          <w:rFonts w:ascii="Garamond" w:hAnsi="Garamond"/>
-        </w:rPr>
-        <w:t>, 2026, collage numérique,</w:t>
-      </w:r>
-      <w:r>
-        <w:rPr>
-          <w:rFonts w:ascii="Garamond" w:hAnsi="Garamond"/>
-        </w:rPr>
-        <w:t xml:space="preserve"> d’apr</w:t>
-      </w:r>
-      <w:r>
-        <w:rPr>
-          <w:rFonts w:ascii="Garamond" w:hAnsi="Garamond"/>
-        </w:rPr>
-        <w:t>è</w:t>
-      </w:r>
-      <w:r>
-        <w:rPr>
-          <w:rFonts w:ascii="Garamond" w:hAnsi="Garamond"/>
-        </w:rPr>
-        <w:t xml:space="preserve">s iconographie de 1625 de </w:t>
-      </w:r>
-      <w:r>
-        <w:rPr>
-          <w:rFonts w:ascii="Garamond" w:hAnsi="Garamond"/>
-        </w:rPr>
-        <w:t>Etienne Martellange,</w:t>
-      </w:r>
-      <w:r>
-        <w:rPr>
-          <w:rFonts w:ascii="Garamond" w:hAnsi="Garamond"/>
-        </w:rPr>
-        <w:t xml:space="preserve"> photographie de Auguste Thiers de</w:t>
-      </w:r>
-      <w:r>
-        <w:rPr>
-          <w:rFonts w:ascii="Garamond" w:hAnsi="Garamond"/>
-        </w:rPr>
-        <w:t xml:space="preserve"> 1867 de</w:t>
-      </w:r>
-      <w:r>
-        <w:rPr>
-          <w:rFonts w:ascii="Garamond" w:hAnsi="Garamond"/>
-        </w:rPr>
-        <w:t xml:space="preserve"> Nadar</w:t>
-      </w:r>
-      <w:r>
-        <w:rPr>
-          <w:rFonts w:ascii="Garamond" w:hAnsi="Garamond"/>
-        </w:rPr>
-        <w:t xml:space="preserve">, </w:t>
-      </w:r>
-      <w:r>
-        <w:rPr>
-          <w:rFonts w:ascii="Garamond" w:hAnsi="Garamond"/>
-        </w:rPr>
-        <w:t>photographie de l’</w:t>
-      </w:r>
-      <w:r>
-        <w:rPr>
-          <w:rFonts w:ascii="Garamond" w:hAnsi="Garamond"/>
-        </w:rPr>
-        <w:t>exécution</w:t>
-      </w:r>
-      <w:r>
-        <w:rPr>
-          <w:rFonts w:ascii="Garamond" w:hAnsi="Garamond"/>
-        </w:rPr>
-        <w:t xml:space="preserve"> du général Lecomte de 1871, </w:t>
+        <w:t xml:space="preserve">Le Roux Malinsky et Nathan Temime—Voisin, 2026, collage numérique, d’après iconographie de 1625 de Etienne Martellange, photographie de Auguste Thiers de 1867 de Nadar, photographie de l’exécution du général Lecomte de 1871, capture d’écran du numéro du 19 mars 1871 du journal </w:t>
       </w:r>
       <w:r>
         <w:rPr>
@@ -152,13 +68,7 @@
         <w:rPr>
           <w:rFonts w:ascii="Garamond" w:hAnsi="Garamond"/>
         </w:rPr>
-        <w:t>de</w:t>
-      </w:r>
-      <w:r>
-        <w:rPr>
-          <w:rFonts w:ascii="Garamond" w:hAnsi="Garamond"/>
-        </w:rPr>
-        <w:t xml:space="preserve"> </w:t>
+        <w:t xml:space="preserve">de </w:t>
       </w:r>
       <w:r>
         <w:rPr>
@@ -170,13 +80,7 @@
         <w:rPr>
           <w:rFonts w:ascii="Garamond" w:hAnsi="Garamond"/>
         </w:rPr>
-        <w:t>,</w:t>
-      </w:r>
-      <w:r>
-        <w:rPr>
-          <w:rFonts w:ascii="Garamond" w:hAnsi="Garamond"/>
-        </w:rPr>
-        <w:t xml:space="preserve"> de l’huile sur toile </w:t>
+        <w:t xml:space="preserve">, </w:t>
       </w:r>
       <w:r>
         <w:rPr>
@@ -184,7 +88,7 @@
           <w:i/>
           <w:iCs/>
         </w:rPr>
-        <w:t>H</w:t>
+        <w:t>Hôtel Du Tertre, Montmartre</w:t>
       </w:r>
       <w:r>
         <w:rPr>
@@ -192,7 +96,21 @@
           <w:i/>
           <w:iCs/>
         </w:rPr>
-        <w:t>ôtel Du Tertre, Montmartre</w:t>
+        <w:t xml:space="preserve"> </w:t>
+      </w:r>
+      <w:r>
+        <w:rPr>
+          <w:rFonts w:ascii="Garamond" w:hAnsi="Garamond"/>
+        </w:rPr>
+        <w:t xml:space="preserve">huile sur toile de Pierre Hodé, </w:t>
+      </w:r>
+      <w:r>
+        <w:rPr>
+          <w:rFonts w:ascii="Garamond" w:hAnsi="Garamond"/>
+          <w:b/>
+          <w:bCs/>
+        </w:rPr>
+        <w:t> </w:t>
       </w:r>
       <w:r>
         <w:rPr>
@@ -200,27 +118,7 @@
           <w:i/>
           <w:iCs/>
         </w:rPr>
-        <w:t xml:space="preserve"> </w:t>
-      </w:r>
-      <w:r>
-        <w:rPr>
-          <w:rFonts w:ascii="Garamond" w:hAnsi="Garamond"/>
-        </w:rPr>
-        <w:t>de Pierre Hodé</w:t>
-      </w:r>
-      <w:r>
-        <w:rPr>
-          <w:rFonts w:ascii="Garamond" w:hAnsi="Garamond"/>
-        </w:rPr>
-        <w:t xml:space="preserve">, </w:t>
-      </w:r>
-      <w:r>
-        <w:rPr>
-          <w:rFonts w:ascii="Garamond" w:hAnsi="Garamond"/>
-          <w:b/>
-          <w:bCs/>
-        </w:rPr>
-        <w:t> </w:t>
+        <w:t>Maison où se trouvait en 1790 la première mairie de la commune de Montmartre</w:t>
       </w:r>
       <w:r>
         <w:rPr>
@@ -228,7 +126,13 @@
           <w:i/>
           <w:iCs/>
         </w:rPr>
-        <w:t>Maison où se trouvait en 1790 la première mairie de la commune de Montmartre</w:t>
+        <w:t xml:space="preserve"> </w:t>
+      </w:r>
+      <w:r>
+        <w:rPr>
+          <w:rFonts w:ascii="Garamond" w:hAnsi="Garamond"/>
+        </w:rPr>
+        <w:t xml:space="preserve">photographie de 1905, </w:t>
       </w:r>
       <w:r>
         <w:rPr>
@@ -236,43 +140,156 @@
           <w:i/>
           <w:iCs/>
         </w:rPr>
+        <w:t>Ancienne église et la tour du télégraphe à Montmartre</w:t>
+      </w:r>
+      <w:r>
+        <w:rPr>
+          <w:rFonts w:ascii="Garamond" w:hAnsi="Garamond"/>
+        </w:rPr>
+        <w:t xml:space="preserve"> dessin avec aquarelle du 19</w:t>
+      </w:r>
+      <w:r>
+        <w:rPr>
+          <w:rFonts w:ascii="Garamond" w:hAnsi="Garamond"/>
+          <w:vertAlign w:val="superscript"/>
+        </w:rPr>
+        <w:t>e</w:t>
+      </w:r>
+      <w:r>
+        <w:rPr>
+          <w:rFonts w:ascii="Garamond" w:hAnsi="Garamond"/>
+        </w:rPr>
+        <w:t xml:space="preserve"> siècle, p</w:t>
+      </w:r>
+      <w:r>
+        <w:rPr>
+          <w:rFonts w:ascii="Garamond" w:hAnsi="Garamond"/>
+        </w:rPr>
+        <w:t>roclamation du</w:t>
+      </w:r>
+      <w:r>
+        <w:rPr>
+          <w:rFonts w:ascii="Garamond" w:hAnsi="Garamond"/>
+        </w:rPr>
         <w:t xml:space="preserve"> </w:t>
       </w:r>
       <w:r>
         <w:rPr>
           <w:rFonts w:ascii="Garamond" w:hAnsi="Garamond"/>
         </w:rPr>
-        <w:t>photographie de</w:t>
-      </w:r>
-      <w:r>
-        <w:rPr>
-          <w:rFonts w:ascii="Garamond" w:hAnsi="Garamond"/>
-        </w:rPr>
-        <w:t xml:space="preserve"> 1905</w:t>
-      </w:r>
-      <w:r>
-        <w:rPr>
-          <w:rFonts w:ascii="Garamond" w:hAnsi="Garamond"/>
-        </w:rPr>
-        <w:t xml:space="preserve"> et </w:t>
-      </w:r>
-      <w:r>
-        <w:rPr>
-          <w:rFonts w:ascii="Garamond" w:hAnsi="Garamond"/>
-        </w:rPr>
-        <w:t>Ancienne église et la tour du télégraphe à Montmartr</w:t>
-      </w:r>
-      <w:r>
-        <w:rPr>
-          <w:rFonts w:ascii="Garamond" w:hAnsi="Garamond"/>
-        </w:rPr>
-        <w:t>e dessin avec aquarelle vers 1800.</w:t>
-      </w:r>
-      <w:r>
-        <w:rPr>
-          <w:rFonts w:ascii="Garamond" w:hAnsi="Garamond"/>
-        </w:rPr>
-        <w:t xml:space="preserve"> fonds Temime--Voisin et Le Roux Malinsky</w:t>
+        <w:t>g</w:t>
+      </w:r>
+      <w:r>
+        <w:rPr>
+          <w:rFonts w:ascii="Garamond" w:hAnsi="Garamond"/>
+        </w:rPr>
+        <w:t xml:space="preserve">ouvernement provisoire dirigé par Thiers </w:t>
+      </w:r>
+      <w:r>
+        <w:rPr>
+          <w:rFonts w:ascii="Garamond" w:hAnsi="Garamond"/>
+        </w:rPr>
+        <w:t xml:space="preserve">du </w:t>
+      </w:r>
+      <w:r>
+        <w:rPr>
+          <w:rFonts w:ascii="Garamond" w:hAnsi="Garamond"/>
+        </w:rPr>
+        <w:t>17 mars 1871</w:t>
+      </w:r>
+      <w:r>
+        <w:rPr>
+          <w:rFonts w:ascii="Garamond" w:hAnsi="Garamond"/>
+        </w:rPr>
+        <w:t xml:space="preserve">, article extrait du numéro du 19 mars 1871 du journal </w:t>
+      </w:r>
+      <w:r>
+        <w:rPr>
+          <w:rFonts w:ascii="Garamond" w:hAnsi="Garamond"/>
+          <w:i/>
+          <w:iCs/>
+        </w:rPr>
+        <w:t>Le Siècle</w:t>
+      </w:r>
+      <w:r>
+        <w:rPr>
+          <w:rFonts w:ascii="Garamond" w:hAnsi="Garamond"/>
+        </w:rPr>
+        <w:t>, t</w:t>
+      </w:r>
+      <w:r>
+        <w:rPr>
+          <w:rFonts w:ascii="Garamond" w:hAnsi="Garamond"/>
+        </w:rPr>
+        <w:t>é</w:t>
+      </w:r>
+      <w:r>
+        <w:rPr>
+          <w:rFonts w:ascii="Garamond" w:hAnsi="Garamond"/>
+        </w:rPr>
+        <w:t>moi</w:t>
+      </w:r>
+      <w:r>
+        <w:rPr>
+          <w:rFonts w:ascii="Garamond" w:hAnsi="Garamond"/>
+        </w:rPr>
+        <w:t>gnage de Louise Mich</w:t>
+      </w:r>
+      <w:r>
+        <w:rPr>
+          <w:rFonts w:ascii="Garamond" w:hAnsi="Garamond"/>
+        </w:rPr>
+        <w:t>el</w:t>
+      </w:r>
+      <w:r>
+        <w:rPr>
+          <w:rFonts w:ascii="Garamond" w:hAnsi="Garamond"/>
+        </w:rPr>
+        <w:t xml:space="preserve">, extrait du </w:t>
+      </w:r>
+      <w:r>
+        <w:rPr>
+          <w:rFonts w:ascii="Garamond" w:hAnsi="Garamond"/>
+          <w:i/>
+          <w:iCs/>
+        </w:rPr>
+        <w:t>Journal officiel</w:t>
+      </w:r>
+      <w:r>
+        <w:rPr>
+          <w:rFonts w:ascii="Garamond" w:hAnsi="Garamond"/>
+        </w:rPr>
+        <w:t>  du 19 mars</w:t>
+      </w:r>
+      <w:r>
+        <w:rPr>
+          <w:rFonts w:ascii="Garamond" w:hAnsi="Garamond"/>
+        </w:rPr>
+        <w:t xml:space="preserve"> 1871, citation de Max Orlan, citation de Francis Corco, premier message transmis par le télégraphe de Montmartre</w:t>
+      </w:r>
+      <w:r>
+        <w:rPr>
+          <w:rFonts w:ascii="Garamond" w:hAnsi="Garamond"/>
+        </w:rPr>
+        <w:t>, extrait de l’acte de fondation de l’abbaye royale Notre Dame de Montmartre</w:t>
+      </w:r>
+      <w:r>
+        <w:rPr>
+          <w:rFonts w:ascii="Garamond" w:hAnsi="Garamond"/>
+        </w:rPr>
+        <w:t xml:space="preserve">, extrait du compte rendu de la séance de l’assemblée nationale du 12 juin 1790 </w:t>
+      </w:r>
+      <w:r>
+        <w:rPr>
+          <w:rFonts w:ascii="Garamond" w:hAnsi="Garamond"/>
+        </w:rPr>
+        <w:t>.</w:t>
+      </w:r>
+      <w:r>
+        <w:rPr>
+          <w:rFonts w:ascii="Garamond" w:hAnsi="Garamond"/>
+        </w:rPr>
+        <w:t xml:space="preserve"> fonds Temime--Voisin et Le Roux Malinsky.</w:t>
       </w:r>
     </w:p>
     <w:p>
@@ -295,15 +312,7 @@
           <w:i/>
           <w:iCs/>
         </w:rPr>
-        <w:t>là où tout ce mélange</w:t>
-      </w:r>
-      <w:r>
-        <w:rPr>
-          <w:rFonts w:ascii="Garamond" w:hAnsi="Garamond"/>
-          <w:i/>
-          <w:iCs/>
-        </w:rPr>
-        <w:t xml:space="preserve"> </w:t>
+        <w:t xml:space="preserve">là où tout ce mélange </w:t>
       </w:r>
       <w:r>
         <w:rPr>
@@ -345,13 +354,13 @@
         <w:rPr>
           <w:rFonts w:ascii="Garamond" w:hAnsi="Garamond"/>
         </w:rPr>
-        <w:t xml:space="preserve"> la place du Tertre est un espace </w:t>
-      </w:r>
-      <w:r>
-        <w:rPr>
-          <w:rFonts w:ascii="Garamond" w:hAnsi="Garamond"/>
-        </w:rPr>
-        <w:t xml:space="preserve"> bb</w:t>
+        <w:t xml:space="preserve"> la place du Tertre est un espace</w:t>
+      </w:r>
+      <w:r>
+        <w:rPr>
+          <w:rFonts w:ascii="Garamond" w:hAnsi="Garamond"/>
+        </w:rPr>
+        <w:t> ?????</w:t>
       </w:r>
       <w:r>
         <w:rPr>
@@ -1043,11 +1052,11 @@
       <w:lang w:eastAsia="en-US"/>
     </w:rPr>
   </w:style>
-  <w:style w:type="paragraph" w:styleId="Titre1">
+  <w:style w:type="paragraph" w:styleId="Heading1">
     <w:name w:val="heading 1"/>
     <w:basedOn w:val="Normal"/>
     <w:next w:val="Normal"/>
-    <w:link w:val="Titre1Car"/>
+    <w:link w:val="Heading1Char"/>
     <w:uiPriority w:val="9"/>
     <w:qFormat/>
     <w:rsid w:val="000410A4"/>
@@ -1064,11 +1073,11 @@
       <w:szCs w:val="40"/>
     </w:rPr>
   </w:style>
-  <w:style w:type="paragraph" w:styleId="Titre2">
+  <w:style w:type="paragraph" w:styleId="Heading2">
     <w:name w:val="heading 2"/>
     <w:basedOn w:val="Normal"/>
     <w:next w:val="Normal"/>
-    <w:link w:val="Titre2Car"/>
+    <w:link w:val="Heading2Char"/>
     <w:uiPriority w:val="9"/>
     <w:unhideWhenUsed/>
     <w:qFormat/>
@@ -1086,11 +1095,11 @@
       <w:szCs w:val="32"/>
     </w:rPr>
   </w:style>
-  <w:style w:type="paragraph" w:styleId="Titre3">
+  <w:style w:type="paragraph" w:styleId="Heading3">
     <w:name w:val="heading 3"/>
     <w:basedOn w:val="Normal"/>
     <w:next w:val="Normal"/>
-    <w:link w:val="Titre3Car"/>
+    <w:link w:val="Heading3Char"/>
     <w:uiPriority w:val="9"/>
     <w:semiHidden/>
     <w:unhideWhenUsed/>
@@ -1109,11 +1118,11 @@
       <w:szCs w:val="28"/>
     </w:rPr>
   </w:style>
-  <w:style w:type="paragraph" w:styleId="Titre4">
+  <w:style w:type="paragraph" w:styleId="Heading4">
     <w:name w:val="heading 4"/>
     <w:basedOn w:val="Normal"/>
     <w:next w:val="Normal"/>
-    <w:link w:val="Titre4Car"/>
+    <w:link w:val="Heading4Char"/>
     <w:uiPriority w:val="9"/>
     <w:semiHidden/>
     <w:unhideWhenUsed/>
@@ -1132,11 +1141,11 @@
       <w:color w:val="0F4761"/>
     </w:rPr>
   </w:style>
-  <w:style w:type="paragraph" w:styleId="Titre5">
+  <w:style w:type="paragraph" w:styleId="Heading5">
     <w:name w:val="heading 5"/>
     <w:basedOn w:val="Normal"/>
     <w:next w:val="Normal"/>
-    <w:link w:val="Titre5Car"/>
+    <w:link w:val="Heading5Char"/>
     <w:uiPriority w:val="9"/>
     <w:semiHidden/>
     <w:unhideWhenUsed/>
@@ -1153,11 +1162,11 @@
       <w:color w:val="0F4761"/>
     </w:rPr>
   </w:style>
-  <w:style w:type="paragraph" w:styleId="Titre6">
+  <w:style w:type="paragraph" w:styleId="Heading6">
     <w:name w:val="heading 6"/>
     <w:basedOn w:val="Normal"/>
     <w:next w:val="Normal"/>
-    <w:link w:val="Titre6Car"/>
+    <w:link w:val="Heading6Char"/>
     <w:uiPriority w:val="9"/>
     <w:semiHidden/>
     <w:unhideWhenUsed/>
@@ -1176,11 +1185,11 @@
       <w:color w:val="595959"/>
     </w:rPr>
   </w:style>
-  <w:style w:type="paragraph" w:styleId="Titre7">
+  <w:style w:type="paragraph" w:styleId="Heading7">
     <w:name w:val="heading 7"/>
     <w:basedOn w:val="Normal"/>
     <w:next w:val="Normal"/>
-    <w:link w:val="Titre7Car"/>
+    <w:link w:val="Heading7Char"/>
     <w:uiPriority w:val="9"/>
     <w:semiHidden/>
     <w:unhideWhenUsed/>
@@ -1197,11 +1206,11 @@
       <w:color w:val="595959"/>
     </w:rPr>
   </w:style>
-  <w:style w:type="paragraph" w:styleId="Titre8">
+  <w:style w:type="paragraph" w:styleId="Heading8">
     <w:name w:val="heading 8"/>
     <w:basedOn w:val="Normal"/>
     <w:next w:val="Normal"/>
-    <w:link w:val="Titre8Car"/>
+    <w:link w:val="Heading8Char"/>
     <w:uiPriority w:val="9"/>
     <w:semiHidden/>
     <w:unhideWhenUsed/>
@@ -1220,11 +1229,11 @@
       <w:color w:val="272727"/>
     </w:rPr>
   </w:style>
-  <w:style w:type="paragraph" w:styleId="Titre9">
+  <w:style w:type="paragraph" w:styleId="Heading9">
     <w:name w:val="heading 9"/>
     <w:basedOn w:val="Normal"/>
     <w:next w:val="Normal"/>
-    <w:link w:val="Titre9Car"/>
+    <w:link w:val="Heading9Char"/>
     <w:uiPriority w:val="9"/>
     <w:semiHidden/>
     <w:unhideWhenUsed/>
@@ -1241,12 +1250,13 @@
       <w:color w:val="272727"/>
     </w:rPr>
   </w:style>
-  <w:style w:type="character" w:default="1" w:styleId="Policepardfaut">
+  <w:style w:type="character" w:default="1" w:styleId="DefaultParagraphFont">
     <w:name w:val="Default Paragraph Font"/>
     <w:uiPriority w:val="1"/>
+    <w:semiHidden/>
     <w:unhideWhenUsed/>
   </w:style>
-  <w:style w:type="table" w:default="1" w:styleId="TableauNormal">
+  <w:style w:type="table" w:default="1" w:styleId="TableNormal">
     <w:name w:val="Normal Table"/>
     <w:uiPriority w:val="99"/>
     <w:semiHidden/>
@@ -1261,15 +1271,15 @@
       </w:tblCellMar>
     </w:tblPr>
   </w:style>
-  <w:style w:type="numbering" w:default="1" w:styleId="Aucuneliste">
+  <w:style w:type="numbering" w:default="1" w:styleId="NoList">
     <w:name w:val="No List"/>
     <w:uiPriority w:val="99"/>
     <w:semiHidden/>
     <w:unhideWhenUsed/>
   </w:style>
-  <w:style w:type="character" w:customStyle="1" w:styleId="Titre1Car">
-    <w:name w:val="Titre 1 Car"/>
-    <w:link w:val="Titre1"/>
+  <w:style w:type="character" w:customStyle="1" w:styleId="Heading1Char">
+    <w:name w:val="Heading 1 Char"/>
+    <w:link w:val="Heading1"/>
     <w:uiPriority w:val="9"/>
     <w:rsid w:val="000410A4"/>
     <w:rPr>
@@ -1279,9 +1289,9 @@
       <w:szCs w:val="40"/>
     </w:rPr>
   </w:style>
-  <w:style w:type="character" w:customStyle="1" w:styleId="Titre2Car">
-    <w:name w:val="Titre 2 Car"/>
-    <w:link w:val="Titre2"/>
+  <w:style w:type="character" w:customStyle="1" w:styleId="Heading2Char">
+    <w:name w:val="Heading 2 Char"/>
+    <w:link w:val="Heading2"/>
     <w:uiPriority w:val="9"/>
     <w:rsid w:val="000410A4"/>
     <w:rPr>
@@ -1291,9 +1301,9 @@
       <w:szCs w:val="32"/>
     </w:rPr>
   </w:style>
-  <w:style w:type="character" w:customStyle="1" w:styleId="Titre3Car">
-    <w:name w:val="Titre 3 Car"/>
-    <w:link w:val="Titre3"/>
+  <w:style w:type="character" w:customStyle="1" w:styleId="Heading3Char">
+    <w:name w:val="Heading 3 Char"/>
+    <w:link w:val="Heading3"/>
     <w:uiPriority w:val="9"/>
     <w:semiHidden/>
     <w:rsid w:val="000410A4"/>
@@ -1304,9 +1314,9 @@
       <w:szCs w:val="28"/>
     </w:rPr>
   </w:style>
-  <w:style w:type="character" w:customStyle="1" w:styleId="Titre4Car">
-    <w:name w:val="Titre 4 Car"/>
-    <w:link w:val="Titre4"/>
+  <w:style w:type="character" w:customStyle="1" w:styleId="Heading4Char">
+    <w:name w:val="Heading 4 Char"/>
+    <w:link w:val="Heading4"/>
     <w:uiPriority w:val="9"/>
     <w:semiHidden/>
     <w:rsid w:val="000410A4"/>
@@ -1317,9 +1327,9 @@
       <w:color w:val="0F4761"/>
     </w:rPr>
   </w:style>
-  <w:style w:type="character" w:customStyle="1" w:styleId="Titre5Car">
-    <w:name w:val="Titre 5 Car"/>
-    <w:link w:val="Titre5"/>
+  <w:style w:type="character" w:customStyle="1" w:styleId="Heading5Char">
+    <w:name w:val="Heading 5 Char"/>
+    <w:link w:val="Heading5"/>
     <w:uiPriority w:val="9"/>
     <w:semiHidden/>
     <w:rsid w:val="000410A4"/>
@@ -1328,9 +1338,9 @@
       <w:color w:val="0F4761"/>
     </w:rPr>
   </w:style>
-  <w:style w:type="character" w:customStyle="1" w:styleId="Titre6Car">
-    <w:name w:val="Titre 6 Car"/>
-    <w:link w:val="Titre6"/>
+  <w:style w:type="character" w:customStyle="1" w:styleId="Heading6Char">
+    <w:name w:val="Heading 6 Char"/>
+    <w:link w:val="Heading6"/>
     <w:uiPriority w:val="9"/>
     <w:semiHidden/>
     <w:rsid w:val="000410A4"/>
@@ -1341,9 +1351,9 @@
       <w:color w:val="595959"/>
     </w:rPr>
   </w:style>
-  <w:style w:type="character" w:customStyle="1" w:styleId="Titre7Car">
-    <w:name w:val="Titre 7 Car"/>
-    <w:link w:val="Titre7"/>
+  <w:style w:type="character" w:customStyle="1" w:styleId="Heading7Char">
+    <w:name w:val="Heading 7 Char"/>
+    <w:link w:val="Heading7"/>
     <w:uiPriority w:val="9"/>
     <w:semiHidden/>
     <w:rsid w:val="000410A4"/>
@@ -1352,9 +1362,9 @@
       <w:color w:val="595959"/>
     </w:rPr>
   </w:style>
-  <w:style w:type="character" w:customStyle="1" w:styleId="Titre8Car">
-    <w:name w:val="Titre 8 Car"/>
-    <w:link w:val="Titre8"/>
+  <w:style w:type="character" w:customStyle="1" w:styleId="Heading8Char">
+    <w:name w:val="Heading 8 Char"/>
+    <w:link w:val="Heading8"/>
     <w:uiPriority w:val="9"/>
     <w:semiHidden/>
     <w:rsid w:val="000410A4"/>
@@ -1365,9 +1375,9 @@
       <w:color w:val="272727"/>
     </w:rPr>
   </w:style>
-  <w:style w:type="character" w:customStyle="1" w:styleId="Titre9Car">
-    <w:name w:val="Titre 9 Car"/>
-    <w:link w:val="Titre9"/>
+  <w:style w:type="character" w:customStyle="1" w:styleId="Heading9Char">
+    <w:name w:val="Heading 9 Char"/>
+    <w:link w:val="Heading9"/>
     <w:uiPriority w:val="9"/>
     <w:semiHidden/>
     <w:rsid w:val="000410A4"/>
@@ -1376,11 +1386,11 @@
       <w:color w:val="272727"/>
     </w:rPr>
   </w:style>
-  <w:style w:type="paragraph" w:styleId="Titre">
+  <w:style w:type="paragraph" w:styleId="Title">
     <w:name w:val="Title"/>
     <w:basedOn w:val="Normal"/>
     <w:next w:val="Normal"/>
-    <w:link w:val="TitreCar"/>
+    <w:link w:val="TitleChar"/>
     <w:uiPriority w:val="10"/>
     <w:qFormat/>
     <w:rsid w:val="000410A4"/>
@@ -1396,9 +1406,9 @@
       <w:szCs w:val="56"/>
     </w:rPr>
   </w:style>
-  <w:style w:type="character" w:customStyle="1" w:styleId="TitreCar">
-    <w:name w:val="Titre Car"/>
-    <w:link w:val="Titre"/>
+  <w:style w:type="character" w:customStyle="1" w:styleId="TitleChar">
+    <w:name w:val="Title Char"/>
+    <w:link w:val="Title"/>
     <w:uiPriority w:val="10"/>
     <w:rsid w:val="000410A4"/>
     <w:rPr>
@@ -1409,11 +1419,11 @@
       <w:szCs w:val="56"/>
     </w:rPr>
   </w:style>
-  <w:style w:type="paragraph" w:styleId="Sous-titre">
+  <w:style w:type="paragraph" w:styleId="Subtitle">
     <w:name w:val="Subtitle"/>
     <w:basedOn w:val="Normal"/>
     <w:next w:val="Normal"/>
-    <w:link w:val="Sous-titreCar"/>
+    <w:link w:val="SubtitleChar"/>
     <w:uiPriority w:val="11"/>
     <w:qFormat/>
     <w:rsid w:val="000410A4"/>
@@ -1430,9 +1440,9 @@
       <w:szCs w:val="28"/>
     </w:rPr>
   </w:style>
-  <w:style w:type="character" w:customStyle="1" w:styleId="Sous-titreCar">
-    <w:name w:val="Sous-titre Car"/>
-    <w:link w:val="Sous-titre"/>
+  <w:style w:type="character" w:customStyle="1" w:styleId="SubtitleChar">
+    <w:name w:val="Subtitle Char"/>
+    <w:link w:val="Subtitle"/>
     <w:uiPriority w:val="11"/>
     <w:rsid w:val="000410A4"/>
     <w:rPr>
@@ -1443,11 +1453,11 @@
       <w:szCs w:val="28"/>
     </w:rPr>
   </w:style>
-  <w:style w:type="paragraph" w:styleId="Citation">
+  <w:style w:type="paragraph" w:styleId="Quote">
     <w:name w:val="Quote"/>
     <w:basedOn w:val="Normal"/>
     <w:next w:val="Normal"/>
-    <w:link w:val="CitationCar"/>
+    <w:link w:val="QuoteChar"/>
     <w:uiPriority w:val="29"/>
     <w:qFormat/>
     <w:rsid w:val="000410A4"/>
@@ -1461,9 +1471,9 @@
       <w:color w:val="404040"/>
     </w:rPr>
   </w:style>
-  <w:style w:type="character" w:customStyle="1" w:styleId="CitationCar">
-    <w:name w:val="Citation Car"/>
-    <w:link w:val="Citation"/>
+  <w:style w:type="character" w:customStyle="1" w:styleId="QuoteChar">
+    <w:name w:val="Quote Char"/>
+    <w:link w:val="Quote"/>
     <w:uiPriority w:val="29"/>
     <w:rsid w:val="000410A4"/>
     <w:rPr>
@@ -1472,7 +1482,7 @@
       <w:color w:val="404040"/>
     </w:rPr>
   </w:style>
-  <w:style w:type="paragraph" w:styleId="Paragraphedeliste">
+  <w:style w:type="paragraph" w:styleId="ListParagraph">
     <w:name w:val="List Paragraph"/>
     <w:basedOn w:val="Normal"/>
     <w:uiPriority w:val="34"/>
@@ -1483,7 +1493,7 @@
       <w:contextualSpacing/>
     </w:pPr>
   </w:style>
-  <w:style w:type="character" w:styleId="Accentuationintense">
+  <w:style w:type="character" w:styleId="IntenseEmphasis">
     <w:name w:val="Intense Emphasis"/>
     <w:uiPriority w:val="21"/>
     <w:qFormat/>
@@ -1494,11 +1504,11 @@
       <w:color w:val="0F4761"/>
     </w:rPr>
   </w:style>
-  <w:style w:type="paragraph" w:styleId="Citationintense">
+  <w:style w:type="paragraph" w:styleId="IntenseQuote">
     <w:name w:val="Intense Quote"/>
     <w:basedOn w:val="Normal"/>
     <w:next w:val="Normal"/>
-    <w:link w:val="CitationintenseCar"/>
+    <w:link w:val="IntenseQuoteChar"/>
     <w:uiPriority w:val="30"/>
     <w:qFormat/>
     <w:rsid w:val="000410A4"/>
@@ -1517,9 +1527,9 @@
       <w:color w:val="0F4761"/>
     </w:rPr>
   </w:style>
-  <w:style w:type="character" w:customStyle="1" w:styleId="CitationintenseCar">
-    <w:name w:val="Citation intense Car"/>
-    <w:link w:val="Citationintense"/>
+  <w:style w:type="character" w:customStyle="1" w:styleId="IntenseQuoteChar">
+    <w:name w:val="Intense Quote Char"/>
+    <w:link w:val="IntenseQuote"/>
     <w:uiPriority w:val="30"/>
     <w:rsid w:val="000410A4"/>
     <w:rPr>
@@ -1528,7 +1538,7 @@
       <w:color w:val="0F4761"/>
     </w:rPr>
   </w:style>
-  <w:style w:type="character" w:styleId="Rfrenceintense">
+  <w:style w:type="character" w:styleId="IntenseReference">
     <w:name w:val="Intense Reference"/>
     <w:uiPriority w:val="32"/>
     <w:qFormat/>
@@ -1541,9 +1551,9 @@
       <w:spacing w:val="5"/>
     </w:rPr>
   </w:style>
-  <w:style w:type="character" w:styleId="Lienhypertexte">
+  <w:style w:type="character" w:styleId="Hyperlink">
     <w:name w:val="Hyperlink"/>
-    <w:basedOn w:val="Policepardfaut"/>
+    <w:basedOn w:val="DefaultParagraphFont"/>
     <w:uiPriority w:val="99"/>
     <w:unhideWhenUsed/>
     <w:rsid w:val="002F2A02"/>
@@ -1552,9 +1562,9 @@
       <w:u w:val="single"/>
     </w:rPr>
   </w:style>
-  <w:style w:type="character" w:styleId="Mentionnonrsolue">
+  <w:style w:type="character" w:styleId="UnresolvedMention">
     <w:name w:val="Unresolved Mention"/>
-    <w:basedOn w:val="Policepardfaut"/>
+    <w:basedOn w:val="DefaultParagraphFont"/>
     <w:uiPriority w:val="99"/>
     <w:semiHidden/>
     <w:unhideWhenUsed/>

</xml_diff>